<commit_message>
Implementa consola administrativa y entorno movil
</commit_message>
<xml_diff>
--- a/outputs/Documento_funcional_MVP_Mototaxi_Atacames.docx
+++ b/outputs/Documento_funcional_MVP_Mototaxi_Atacames.docx
@@ -311,15 +311,8 @@
             <w:shd w:fill="F4F8FA"/>
           </w:tcPr>
           <w:p>
-            <w:pPr>
-              <w:spacing w:after="0" w:line="252" w:lineRule="auto"/>
-            </w:pPr>
-            <w:r>
-              <w:rPr>
-                <w:rFonts w:ascii="Aptos" w:hAnsi="Aptos"/>
-                <w:sz w:val="18"/>
-              </w:rPr>
-              <w:t>1.0 · 27 de julio de 2026</w:t>
+            <w:r>
+              <w:t>1.1 · 29 de julio de 2026</w:t>
             </w:r>
           </w:p>
         </w:tc>
@@ -13882,6 +13875,534 @@
       </w:pPr>
       <w:r>
         <w:t>La capacidad máxima del vehículo se definirá después de validación operativa.</w:t>
+      </w:r>
+    </w:p>
+    <w:p>
+      <w:r>
+        <w:br w:type="page"/>
+      </w:r>
+    </w:p>
+    <w:p>
+      <w:pPr>
+        <w:pStyle w:val="Heading1"/>
+      </w:pPr>
+      <w:r>
+        <w:t>13. Estado técnico de la implementación</w:t>
+      </w:r>
+    </w:p>
+    <w:p>
+      <w:r>
+        <w:rPr>
+          <w:b/>
+        </w:rPr>
+        <w:t xml:space="preserve">Actualización 1.1. </w:t>
+      </w:r>
+      <w:r>
+        <w:t>La base técnica y la primera consola administrativa navegable ya están implementadas. Esta sección registra lo construido, cómo reproducir el entorno y qué controles deben reforzarse antes de producción.</w:t>
+      </w:r>
+    </w:p>
+    <w:p>
+      <w:pPr>
+        <w:pStyle w:val="Heading2"/>
+      </w:pPr>
+      <w:r>
+        <w:t>13.1 Consola administrativa implementada</w:t>
+      </w:r>
+    </w:p>
+    <w:p>
+      <w:pPr>
+        <w:pStyle w:val="ListBullet"/>
+      </w:pPr>
+      <w:r>
+        <w:t>Inicio de sesión para los roles Administrador y Soporte, con autorización diferenciada en la API.</w:t>
+      </w:r>
+    </w:p>
+    <w:p>
+      <w:pPr>
+        <w:pStyle w:val="ListBullet"/>
+      </w:pPr>
+      <w:r>
+        <w:t>Tablero operativo con métricas y listado de viajes activos del piloto.</w:t>
+      </w:r>
+    </w:p>
+    <w:p>
+      <w:pPr>
+        <w:pStyle w:val="ListBullet"/>
+      </w:pPr>
+      <w:r>
+        <w:t>Gestión de conductores: consulta, aprobación, rechazo y suspensión con motivo auditado.</w:t>
+      </w:r>
+    </w:p>
+    <w:p>
+      <w:pPr>
+        <w:pStyle w:val="ListBullet"/>
+      </w:pPr>
+      <w:r>
+        <w:t>Gestión de pasajeros: consulta, suspensión y reactivación.</w:t>
+      </w:r>
+    </w:p>
+    <w:p>
+      <w:pPr>
+        <w:pStyle w:val="ListBullet"/>
+      </w:pPr>
+      <w:r>
+        <w:t>Publicación e historial de versiones tarifarias con fecha de vigencia.</w:t>
+      </w:r>
+    </w:p>
+    <w:p>
+      <w:pPr>
+        <w:pStyle w:val="ListBullet"/>
+      </w:pPr>
+      <w:r>
+        <w:t>Editor poligonal para dibujar zonas urbanas y extendidas y conservar su versión.</w:t>
+      </w:r>
+    </w:p>
+    <w:p>
+      <w:pPr>
+        <w:pStyle w:val="ListBullet"/>
+      </w:pPr>
+      <w:r>
+        <w:t>Gestión de incidentes: estado, asignación y resolución por soporte.</w:t>
+      </w:r>
+    </w:p>
+    <w:p>
+      <w:pPr>
+        <w:pStyle w:val="ListBullet"/>
+      </w:pPr>
+      <w:r>
+        <w:t>Auditoría de accesos y cambios sensibles, visible solo para administradores.</w:t>
+      </w:r>
+    </w:p>
+    <w:p>
+      <w:pPr>
+        <w:pStyle w:val="ListBullet"/>
+      </w:pPr>
+      <w:r>
+        <w:t>Diagnóstico de conexión a PostgreSQL y verificación de la extensión PostGIS.</w:t>
+      </w:r>
+    </w:p>
+    <w:p>
+      <w:pPr>
+        <w:pStyle w:val="Heading2"/>
+      </w:pPr>
+      <w:r>
+        <w:t>13.2 Persistencia y entorno reproducible</w:t>
+      </w:r>
+    </w:p>
+    <w:p>
+      <w:r>
+        <w:t>El repositorio incorpora PostgreSQL 16 con PostGIS 3.4 mediante Docker Compose, migraciones SQL incrementales y un ejecutor que registra cada migración aplicada. La primera migración cubre usuarios, conductores, vehículos, zonas, tarifas, viajes, ofertas, eventos y auditoría. La segunda añade documentos, calificaciones, incidentes y sesiones administrativas.</w:t>
+      </w:r>
+    </w:p>
+    <w:tbl>
+      <w:tblPr>
+        <w:tblStyle w:val="TableGrid"/>
+        <w:tblW w:type="auto" w:w="0"/>
+        <w:jc w:val="center"/>
+        <w:tblLook w:firstColumn="1" w:firstRow="1" w:lastColumn="0" w:lastRow="0" w:noHBand="0" w:noVBand="1" w:val="04A0"/>
+      </w:tblPr>
+      <w:tblGrid>
+        <w:gridCol w:w="3216"/>
+        <w:gridCol w:w="3216"/>
+        <w:gridCol w:w="3216"/>
+      </w:tblGrid>
+      <w:tr>
+        <w:trPr>
+          <w:tblHeader w:val="true"/>
+        </w:trPr>
+        <w:tc>
+          <w:tcPr>
+            <w:tcW w:type="dxa" w:w="1944"/>
+          </w:tcPr>
+          <w:p>
+            <w:r>
+              <w:rPr>
+                <w:b/>
+              </w:rPr>
+              <w:t>Componente</w:t>
+            </w:r>
+          </w:p>
+        </w:tc>
+        <w:tc>
+          <w:tcPr>
+            <w:tcW w:type="dxa" w:w="2232"/>
+          </w:tcPr>
+          <w:p>
+            <w:r>
+              <w:rPr>
+                <w:b/>
+              </w:rPr>
+              <w:t>Comando</w:t>
+            </w:r>
+          </w:p>
+        </w:tc>
+        <w:tc>
+          <w:tcPr>
+            <w:tcW w:type="dxa" w:w="5184"/>
+          </w:tcPr>
+          <w:p>
+            <w:r>
+              <w:rPr>
+                <w:b/>
+              </w:rPr>
+              <w:t>Resultado</w:t>
+            </w:r>
+          </w:p>
+        </w:tc>
+      </w:tr>
+      <w:tr>
+        <w:tc>
+          <w:tcPr>
+            <w:tcW w:type="dxa" w:w="1944"/>
+            <w:vAlign w:val="center"/>
+          </w:tcPr>
+          <w:p>
+            <w:r>
+              <w:t>Dependencias</w:t>
+            </w:r>
+          </w:p>
+        </w:tc>
+        <w:tc>
+          <w:tcPr>
+            <w:tcW w:type="dxa" w:w="2232"/>
+            <w:vAlign w:val="center"/>
+          </w:tcPr>
+          <w:p>
+            <w:r>
+              <w:t>pnpm install</w:t>
+            </w:r>
+          </w:p>
+        </w:tc>
+        <w:tc>
+          <w:tcPr>
+            <w:tcW w:type="dxa" w:w="5184"/>
+            <w:vAlign w:val="center"/>
+          </w:tcPr>
+          <w:p>
+            <w:r>
+              <w:t>Instala API, panel y dominio.</w:t>
+            </w:r>
+          </w:p>
+        </w:tc>
+      </w:tr>
+      <w:tr>
+        <w:tc>
+          <w:tcPr>
+            <w:tcW w:type="dxa" w:w="1944"/>
+            <w:vAlign w:val="center"/>
+          </w:tcPr>
+          <w:p>
+            <w:r>
+              <w:t>PostGIS</w:t>
+            </w:r>
+          </w:p>
+        </w:tc>
+        <w:tc>
+          <w:tcPr>
+            <w:tcW w:type="dxa" w:w="2232"/>
+            <w:vAlign w:val="center"/>
+          </w:tcPr>
+          <w:p>
+            <w:r>
+              <w:t>pnpm db:up</w:t>
+            </w:r>
+          </w:p>
+        </w:tc>
+        <w:tc>
+          <w:tcPr>
+            <w:tcW w:type="dxa" w:w="5184"/>
+            <w:vAlign w:val="center"/>
+          </w:tcPr>
+          <w:p>
+            <w:r>
+              <w:t>Inicia PostgreSQL/PostGIS local.</w:t>
+            </w:r>
+          </w:p>
+        </w:tc>
+      </w:tr>
+      <w:tr>
+        <w:tc>
+          <w:tcPr>
+            <w:tcW w:type="dxa" w:w="1944"/>
+            <w:vAlign w:val="center"/>
+          </w:tcPr>
+          <w:p>
+            <w:r>
+              <w:t>Migraciones</w:t>
+            </w:r>
+          </w:p>
+        </w:tc>
+        <w:tc>
+          <w:tcPr>
+            <w:tcW w:type="dxa" w:w="2232"/>
+            <w:vAlign w:val="center"/>
+          </w:tcPr>
+          <w:p>
+            <w:r>
+              <w:t>pnpm db:migrate</w:t>
+            </w:r>
+          </w:p>
+        </w:tc>
+        <w:tc>
+          <w:tcPr>
+            <w:tcW w:type="dxa" w:w="5184"/>
+            <w:vAlign w:val="center"/>
+          </w:tcPr>
+          <w:p>
+            <w:r>
+              <w:t>Crea y versiona el esquema.</w:t>
+            </w:r>
+          </w:p>
+        </w:tc>
+      </w:tr>
+      <w:tr>
+        <w:tc>
+          <w:tcPr>
+            <w:tcW w:type="dxa" w:w="1944"/>
+            <w:vAlign w:val="center"/>
+          </w:tcPr>
+          <w:p>
+            <w:r>
+              <w:t>API</w:t>
+            </w:r>
+          </w:p>
+        </w:tc>
+        <w:tc>
+          <w:tcPr>
+            <w:tcW w:type="dxa" w:w="2232"/>
+            <w:vAlign w:val="center"/>
+          </w:tcPr>
+          <w:p>
+            <w:r>
+              <w:t>pnpm dev:api</w:t>
+            </w:r>
+          </w:p>
+        </w:tc>
+        <w:tc>
+          <w:tcPr>
+            <w:tcW w:type="dxa" w:w="5184"/>
+            <w:vAlign w:val="center"/>
+          </w:tcPr>
+          <w:p>
+            <w:r>
+              <w:t>Servidor en http://localhost:3001.</w:t>
+            </w:r>
+          </w:p>
+        </w:tc>
+      </w:tr>
+      <w:tr>
+        <w:tc>
+          <w:tcPr>
+            <w:tcW w:type="dxa" w:w="1944"/>
+            <w:vAlign w:val="center"/>
+          </w:tcPr>
+          <w:p>
+            <w:r>
+              <w:t>Panel</w:t>
+            </w:r>
+          </w:p>
+        </w:tc>
+        <w:tc>
+          <w:tcPr>
+            <w:tcW w:type="dxa" w:w="2232"/>
+            <w:vAlign w:val="center"/>
+          </w:tcPr>
+          <w:p>
+            <w:r>
+              <w:t>pnpm dev:admin</w:t>
+            </w:r>
+          </w:p>
+        </w:tc>
+        <w:tc>
+          <w:tcPr>
+            <w:tcW w:type="dxa" w:w="5184"/>
+            <w:vAlign w:val="center"/>
+          </w:tcPr>
+          <w:p>
+            <w:r>
+              <w:t>Consola en http://localhost:3000.</w:t>
+            </w:r>
+          </w:p>
+        </w:tc>
+      </w:tr>
+      <w:tr>
+        <w:tc>
+          <w:tcPr>
+            <w:tcW w:type="dxa" w:w="1944"/>
+            <w:vAlign w:val="center"/>
+          </w:tcPr>
+          <w:p>
+            <w:r>
+              <w:t>Calidad</w:t>
+            </w:r>
+          </w:p>
+        </w:tc>
+        <w:tc>
+          <w:tcPr>
+            <w:tcW w:type="dxa" w:w="2232"/>
+            <w:vAlign w:val="center"/>
+          </w:tcPr>
+          <w:p>
+            <w:r>
+              <w:t>pnpm test</w:t>
+            </w:r>
+          </w:p>
+        </w:tc>
+        <w:tc>
+          <w:tcPr>
+            <w:tcW w:type="dxa" w:w="5184"/>
+            <w:vAlign w:val="center"/>
+          </w:tcPr>
+          <w:p>
+            <w:r>
+              <w:t>Ejecuta pruebas del monorepo.</w:t>
+            </w:r>
+          </w:p>
+        </w:tc>
+      </w:tr>
+    </w:tbl>
+    <w:p>
+      <w:pPr>
+        <w:pStyle w:val="Heading2"/>
+      </w:pPr>
+      <w:r>
+        <w:t>13.3 Credenciales y datos piloto</w:t>
+      </w:r>
+    </w:p>
+    <w:p>
+      <w:r>
+        <w:t>Para desarrollo local se proporcionan cuentas de demostración configurables mediante variables de entorno:</w:t>
+      </w:r>
+    </w:p>
+    <w:p>
+      <w:pPr>
+        <w:pStyle w:val="ListBullet"/>
+      </w:pPr>
+      <w:r>
+        <w:t>Administrador: admin@mototaxi.local / Mototaxi2026!</w:t>
+      </w:r>
+    </w:p>
+    <w:p>
+      <w:pPr>
+        <w:pStyle w:val="ListBullet"/>
+      </w:pPr>
+      <w:r>
+        <w:t>Soporte: soporte@mototaxi.local / Soporte2026!</w:t>
+      </w:r>
+    </w:p>
+    <w:p>
+      <w:r>
+        <w:rPr>
+          <w:b/>
+        </w:rPr>
+        <w:t xml:space="preserve">Advertencia de seguridad. </w:t>
+      </w:r>
+      <w:r>
+        <w:t>Estas credenciales y el secreto de sesión deben sustituirse antes de cualquier piloto con usuarios reales. Los datos visibles actuales son datos piloto en memoria; las tablas PostGIS están listas, pero el repositorio persistente administrativo debe completarse antes de producción.</w:t>
+      </w:r>
+    </w:p>
+    <w:p>
+      <w:pPr>
+        <w:pStyle w:val="Heading2"/>
+      </w:pPr>
+      <w:r>
+        <w:t>13.4 Validación realizada</w:t>
+      </w:r>
+    </w:p>
+    <w:p>
+      <w:pPr>
+        <w:pStyle w:val="ListBullet"/>
+      </w:pPr>
+      <w:r>
+        <w:t>Flutter analyze y pruebas de widget aprobadas.</w:t>
+      </w:r>
+    </w:p>
+    <w:p>
+      <w:pPr>
+        <w:pStyle w:val="ListBullet"/>
+      </w:pPr>
+      <w:r>
+        <w:t>APK Android de depuración compilado, instalado y ejecutado en un emulador Android 11.</w:t>
+      </w:r>
+    </w:p>
+    <w:p>
+      <w:pPr>
+        <w:pStyle w:val="ListBullet"/>
+      </w:pPr>
+      <w:r>
+        <w:t>Pruebas de dominio, cotización, autenticación, permisos y auditoría aprobadas.</w:t>
+      </w:r>
+    </w:p>
+    <w:p>
+      <w:pPr>
+        <w:pStyle w:val="ListBullet"/>
+      </w:pPr>
+      <w:r>
+        <w:t>TypeScript y compilación de producción del panel aprobados.</w:t>
+      </w:r>
+    </w:p>
+    <w:p>
+      <w:pPr>
+        <w:pStyle w:val="ListBullet"/>
+      </w:pPr>
+      <w:r>
+        <w:t>Entorno Android validado en Windows con Flutter, SDK, JDK, ADB e hipervisor.</w:t>
+      </w:r>
+    </w:p>
+    <w:p>
+      <w:pPr>
+        <w:pStyle w:val="Heading2"/>
+      </w:pPr>
+      <w:r>
+        <w:t>13.5 Pendientes antes de producción</w:t>
+      </w:r>
+    </w:p>
+    <w:p>
+      <w:pPr>
+        <w:pStyle w:val="ListBullet"/>
+      </w:pPr>
+      <w:r>
+        <w:t>Sustituir el almacén piloto por repositorios PostgreSQL en todas las rutas administrativas.</w:t>
+      </w:r>
+    </w:p>
+    <w:p>
+      <w:pPr>
+        <w:pStyle w:val="ListBullet"/>
+      </w:pPr>
+      <w:r>
+        <w:t>Persistir usuarios administrativos con contraseñas hasheadas, expiración y revocación de sesiones y MFA.</w:t>
+      </w:r>
+    </w:p>
+    <w:p>
+      <w:pPr>
+        <w:pStyle w:val="ListBullet"/>
+      </w:pPr>
+      <w:r>
+        <w:t>Integrar proveedor cartográfico real y convertir los puntos del editor a coordenadas geográficas SRID 4326.</w:t>
+      </w:r>
+    </w:p>
+    <w:p>
+      <w:pPr>
+        <w:pStyle w:val="ListBullet"/>
+      </w:pPr>
+      <w:r>
+        <w:t>Conectar datos reales de viajes, ubicaciones, documentos y evidencias.</w:t>
+      </w:r>
+    </w:p>
+    <w:p>
+      <w:pPr>
+        <w:pStyle w:val="ListBullet"/>
+      </w:pPr>
+      <w:r>
+        <w:t>Restringir CORS, habilitar HTTPS, límites de intentos, almacenamiento privado y observabilidad.</w:t>
+      </w:r>
+    </w:p>
+    <w:p>
+      <w:pPr>
+        <w:pStyle w:val="ListBullet"/>
+      </w:pPr>
+      <w:r>
+        <w:t>Completar las validaciones legales, operativas, de privacidad y emergencia indicadas en este documento.</w:t>
       </w:r>
     </w:p>
     <w:sectPr>

</xml_diff>